<commit_message>
updated federal funding lapse language.
</commit_message>
<xml_diff>
--- a/output/releases/2026-04_compass_lens.docx
+++ b/output/releases/2026-04_compass_lens.docx
@@ -468,35 +468,14 @@
           <w:i/>
           <w:iCs/>
         </w:rPr>
-        <w:t>Metrics reflect official LAUS/BLS benchmarks as of</w:t>
+        <w:t xml:space="preserve">Metrics reflect official LAUS/BLS benchmarks as of July 2026. Historical series incorporate all revised estimates released through July 2025. </w:t>
       </w:r>
       <w:r>
         <w:rPr>
           <w:i/>
           <w:iCs/>
         </w:rPr>
-        <w:t xml:space="preserve"> July 2026. </w:t>
-      </w:r>
-      <w:r>
-        <w:rPr>
-          <w:i/>
-          <w:iCs/>
-        </w:rPr>
-        <w:t xml:space="preserve">Historical series incorporate all revised estimates released through </w:t>
-      </w:r>
-      <w:r>
-        <w:rPr>
-          <w:i/>
-          <w:iCs/>
-        </w:rPr>
-        <w:t>July 2025</w:t>
-      </w:r>
-      <w:r>
-        <w:rPr>
-          <w:i/>
-          <w:iCs/>
-        </w:rPr>
-        <w:t>. In October 2025, a federal government shutdown which prohibited the collection of LAUS data. There is no LAUS data for October 2025.</w:t>
+        <w:t>In October 2025, a lapse in federal funding prohibited the collection of LAUS data. There is no LAUS data for October 2025.</w:t>
       </w:r>
     </w:p>
     <w:p>

</xml_diff>